<commit_message>
1.0.20: rút tên thẻ hồ sơ "Khiếu nại, cưỡng chế" thành "Khiếu nại" (di chuột hiện đầy đủ) để 13 thẻ vừa một hàng ở 1366×768 (CI đỏ ở giai-doan-2, van-ban-ho); chụp lại ảnh, tạo lại hướng dẫn Word
Co-Authored-By: Claude Opus 5.5 <noreply@anthropic.com>
Claude-Session: https://claude.ai/code/session_01BZcswa4gE3voAhFCMjfJc5
</commit_message>
<xml_diff>
--- a/apps/desktop/public/huong-dan/Huong-dan-su-dung-GPMB.docx
+++ b/apps/desktop/public/huong-dan/Huong-dan-su-dung-GPMB.docx
@@ -93,7 +93,7 @@
           <w:sz w:val="26"/>
           <w:szCs w:val="26"/>
         </w:rPr>
-        <w:t xml:space="preserve">Phiên bản 1.0.19</w:t>
+        <w:t xml:space="preserve">Phiên bản 1.0.20</w:t>
       </w:r>
     </w:p>
     <w:p>
@@ -3426,7 +3426,7 @@
           <w:sz w:val="26"/>
           <w:szCs w:val="26"/>
         </w:rPr>
-        <w:t xml:space="preserve">Khiếu nại, cưỡng chế</w:t>
+        <w:t xml:space="preserve">Khiếu nại</w:t>
       </w:r>
       <w:r>
         <w:rPr>
@@ -3621,7 +3621,7 @@
           <w:sz w:val="24"/>
           <w:szCs w:val="24"/>
         </w:rPr>
-        <w:t xml:space="preserve">Hình 20. Thẻ Khiếu nại, cưỡng chế — đơn khiếu nại lần đầu</w:t>
+        <w:t xml:space="preserve">Hình 20. Thẻ Khiếu nại (khiếu nại, kiến nghị, cưỡng chế) — đơn khiếu nại lần đầu</w:t>
       </w:r>
     </w:p>
     <w:p>
@@ -4858,7 +4858,7 @@
         <w:sz w:val="20"/>
         <w:szCs w:val="20"/>
       </w:rPr>
-      <w:t xml:space="preserve">Hướng dẫn sử dụng Phần mềm GPMB Sơn La – phiên bản 1.0.19</w:t>
+      <w:t xml:space="preserve">Hướng dẫn sử dụng Phần mềm GPMB Sơn La – phiên bản 1.0.20</w:t>
     </w:r>
   </w:p>
 </w:hdr>

</xml_diff>

<commit_message>
1.0.21: tạo lại hướng dẫn Word (ảnh thẻ Khiếu nại có thủ tục tạm đình chỉ, nút T18–T22)
Co-Authored-By: Claude Opus 5.5 <noreply@anthropic.com>
Claude-Session: https://claude.ai/code/session_01BZcswa4gE3voAhFCMjfJc5
</commit_message>
<xml_diff>
--- a/apps/desktop/public/huong-dan/Huong-dan-su-dung-GPMB.docx
+++ b/apps/desktop/public/huong-dan/Huong-dan-su-dung-GPMB.docx
@@ -93,7 +93,7 @@
           <w:sz w:val="26"/>
           <w:szCs w:val="26"/>
         </w:rPr>
-        <w:t xml:space="preserve">Phiên bản 1.0.20</w:t>
+        <w:t xml:space="preserve">Phiên bản 1.0.21</w:t>
       </w:r>
     </w:p>
     <w:p>
@@ -3463,7 +3463,7 @@
           <w:sz w:val="26"/>
           <w:szCs w:val="26"/>
         </w:rPr>
-        <w:t xml:space="preserve">: ngày nhận, ngày thụ lý, quyết định/hành vi bị khiếu nại, nội dung. Hạn thụ lý 10 ngày làm việc; đơn nhận từ 01/7/2026: 07 ngày làm việc (k1 Đ16 NĐ 124/2020/NĐ-CP, sửa bởi Điều 10 NĐ 155/2026/NĐ-CP); hạn giải quyết lần đầu 30 ngày, phức tạp 45 ngày, vùng sâu vùng xa 45/60 ngày (Điều 28); lần hai 45/60, vùng sâu vùng xa 60/70 ngày (Điều 37). Cán bộ đánh dấu “phức tạp”, “vùng sâu, vùng xa”. Nút “Soạn QĐ giải quyết (T14)” mở mẫu Quyết định giải quyết khiếu nại lần đầu (Mẫu 15 NĐ 124/2020) đã điền đơn; hồ sơ cưỡng chế thu hồi đất có nút T15 (biên bản vận động), T16 (QĐ thành lập Ban cưỡng chế), T17 (phương án, dự toán kinh phí).</w:t>
+        <w:t xml:space="preserve">: ngày nhận, ngày thụ lý, quyết định/hành vi bị khiếu nại, nội dung. Hạn thụ lý 10 ngày làm việc; đơn nhận từ 01/7/2026: 07 ngày làm việc (k1 Đ16 NĐ 124/2020/NĐ-CP, sửa bởi Điều 10 NĐ 155/2026/NĐ-CP); hạn giải quyết lần đầu 30 ngày, phức tạp 45 ngày, vùng sâu vùng xa 45/60 ngày (Điều 28); lần hai 45/60, vùng sâu vùng xa 60/70 ngày (Điều 37). Cán bộ đánh dấu “phức tạp”, “vùng sâu, vùng xa”. Nút “Soạn QĐ giải quyết (T14)” mở mẫu Quyết định giải quyết khiếu nại lần đầu (Mẫu 15 NĐ 124/2020) đã điền đơn; hồ sơ cưỡng chế thu hồi đất có nút T15 (biên bản vận động), T16 (QĐ thành lập Ban cưỡng chế), T17 (phương án, dự toán kinh phí). Khung thủ tục của đơn: số, ngày thông báo thụ lý; “+ Tạm đình chỉ” (thời gian tạm đình chỉ không tính vào hạn — k4 Điều 11a Luật Khiếu nại); vắng đối thoại; nút T18–T22 (thông báo thụ lý, không thụ lý, biên bản đối thoại, QĐ tạm đình chỉ/đình chỉ, QĐ tiếp tục — Phụ lục NĐ 155/2026).</w:t>
       </w:r>
     </w:p>
     <w:p>
@@ -4858,7 +4858,7 @@
         <w:sz w:val="20"/>
         <w:szCs w:val="20"/>
       </w:rPr>
-      <w:t xml:space="preserve">Hướng dẫn sử dụng Phần mềm GPMB Sơn La – phiên bản 1.0.20</w:t>
+      <w:t xml:space="preserve">Hướng dẫn sử dụng Phần mềm GPMB Sơn La – phiên bản 1.0.21</w:t>
     </w:r>
   </w:p>
 </w:hdr>

</xml_diff>

<commit_message>
1.1.0: Hỏi đáp — hỏi khi kho tri thức đang nạp thì chờ nạp xong rồi trả lời (trước đây câu hỏi bị bỏ qua); tạo lại hướng dẫn Word
Co-Authored-By: Claude Opus 5.5 <noreply@anthropic.com>
Claude-Session: https://claude.ai/code/session_01BZcswa4gE3voAhFCMjfJc5
</commit_message>
<xml_diff>
--- a/apps/desktop/public/huong-dan/Huong-dan-su-dung-GPMB.docx
+++ b/apps/desktop/public/huong-dan/Huong-dan-su-dung-GPMB.docx
@@ -93,7 +93,7 @@
           <w:sz w:val="26"/>
           <w:szCs w:val="26"/>
         </w:rPr>
-        <w:t xml:space="preserve">Phiên bản 1.0.21</w:t>
+        <w:t xml:space="preserve">Phiên bản 1.1.0</w:t>
       </w:r>
     </w:p>
     <w:p>
@@ -2923,7 +2923,7 @@
           <w:sz w:val="26"/>
           <w:szCs w:val="26"/>
         </w:rPr>
-        <w:t xml:space="preserve">: 22 mẫu Sổ tay, 13 mẫu theo văn bản thực tế, mẫu riêng của đơn vị; tự điền thông tin hộ, thửa, tài sản, số tiền theo kết quả tính.</w:t>
+        <w:t xml:space="preserve">: 22 mẫu Sổ tay, 25 mẫu theo văn bản thực tế (T1–T25), mẫu riêng của đơn vị; tự điền thông tin hộ, thửa, tài sản, số tiền theo kết quả tính.</w:t>
       </w:r>
     </w:p>
     <w:p>
@@ -2980,6 +2980,80 @@
           <w:szCs w:val="26"/>
         </w:rPr>
         <w:t xml:space="preserve"> ở đầu không gian dự án.</w:t>
+      </w:r>
+    </w:p>
+    <w:p>
+      <w:pPr>
+        <w:pStyle w:val="ListParagraph"/>
+        <w:numPr>
+          <w:ilvl w:val="0"/>
+          <w:numId w:val="10"/>
+        </w:numPr>
+        <w:spacing w:after="100" w:line="300"/>
+        <w:jc w:val="both"/>
+      </w:pPr>
+      <w:r>
+        <w:rPr>
+          <w:rFonts w:ascii="Times New Roman" w:cs="Times New Roman" w:eastAsia="Times New Roman" w:hAnsi="Times New Roman"/>
+          <w:sz w:val="26"/>
+          <w:szCs w:val="26"/>
+        </w:rPr>
+        <w:t xml:space="preserve">Tạo một mẫu cho nhiều hộ một lần (1.1.0): ở danh sách hộ của mẫu, lọc mã/tên rồi Enter để chọn thêm; nhập số đầu tiên → số tăng dần cho từng hộ; nhiều hộ ra một tệp .zip. Số, ngày văn bản ghi ngược vào từng đơn khiếu nại, hồ sơ cưỡng chế (chỉ ô còn trống).</w:t>
+      </w:r>
+    </w:p>
+    <w:p>
+      <w:pPr>
+        <w:pStyle w:val="ListParagraph"/>
+        <w:numPr>
+          <w:ilvl w:val="0"/>
+          <w:numId w:val="10"/>
+        </w:numPr>
+        <w:spacing w:after="100" w:line="300"/>
+        <w:jc w:val="both"/>
+      </w:pPr>
+      <w:r>
+        <w:rPr>
+          <w:rFonts w:ascii="Times New Roman" w:cs="Times New Roman" w:eastAsia="Times New Roman" w:hAnsi="Times New Roman"/>
+          <w:sz w:val="26"/>
+          <w:szCs w:val="26"/>
+        </w:rPr>
+        <w:t xml:space="preserve">Biên bản bàn giao đất trên thực địa (T23, Mẫu 06 NĐ 102/2024) tạo xong thì phần mềm ghi mốc ở thẻ </w:t>
+      </w:r>
+      <w:r>
+        <w:rPr>
+          <w:rFonts w:ascii="Times New Roman" w:cs="Times New Roman" w:eastAsia="Times New Roman" w:hAnsi="Times New Roman"/>
+          <w:b/>
+          <w:bCs/>
+          <w:sz w:val="26"/>
+          <w:szCs w:val="26"/>
+        </w:rPr>
+        <w:t xml:space="preserve">Bàn giao đất trên thực địa</w:t>
+      </w:r>
+      <w:r>
+        <w:rPr>
+          <w:rFonts w:ascii="Times New Roman" w:cs="Times New Roman" w:eastAsia="Times New Roman" w:hAnsi="Times New Roman"/>
+          <w:sz w:val="26"/>
+          <w:szCs w:val="26"/>
+        </w:rPr>
+        <w:t xml:space="preserve"> của Tổng quan dự án; bàn giao làm ngoài phần mềm thì bấm </w:t>
+      </w:r>
+      <w:r>
+        <w:rPr>
+          <w:rFonts w:ascii="Times New Roman" w:cs="Times New Roman" w:eastAsia="Times New Roman" w:hAnsi="Times New Roman"/>
+          <w:b/>
+          <w:bCs/>
+          <w:sz w:val="26"/>
+          <w:szCs w:val="26"/>
+        </w:rPr>
+        <w:t xml:space="preserve">Ghi mốc</w:t>
+      </w:r>
+      <w:r>
+        <w:rPr>
+          <w:rFonts w:ascii="Times New Roman" w:cs="Times New Roman" w:eastAsia="Times New Roman" w:hAnsi="Times New Roman"/>
+          <w:sz w:val="26"/>
+          <w:szCs w:val="26"/>
+        </w:rPr>
+        <w:t xml:space="preserve">. Mốc có trong báo cáo tiến độ và gói gửi tỉnh.</w:t>
       </w:r>
     </w:p>
     <w:p>
@@ -3479,6 +3553,116 @@
       <w:r>
         <w:rPr>
           <w:rFonts w:ascii="Times New Roman" w:cs="Times New Roman" w:eastAsia="Times New Roman" w:hAnsi="Times New Roman"/>
+          <w:sz w:val="26"/>
+          <w:szCs w:val="26"/>
+        </w:rPr>
+        <w:t xml:space="preserve">Từ bản 1.1.0: ghi </w:t>
+      </w:r>
+      <w:r>
+        <w:rPr>
+          <w:rFonts w:ascii="Times New Roman" w:cs="Times New Roman" w:eastAsia="Times New Roman" w:hAnsi="Times New Roman"/>
+          <w:b/>
+          <w:bCs/>
+          <w:sz w:val="26"/>
+          <w:szCs w:val="26"/>
+        </w:rPr>
+        <w:t xml:space="preserve">Ngày tổ chức đối thoại</w:t>
+      </w:r>
+      <w:r>
+        <w:rPr>
+          <w:rFonts w:ascii="Times New Roman" w:cs="Times New Roman" w:eastAsia="Times New Roman" w:hAnsi="Times New Roman"/>
+          <w:sz w:val="26"/>
+          <w:szCs w:val="26"/>
+        </w:rPr>
+        <w:t xml:space="preserve">, </w:t>
+      </w:r>
+      <w:r>
+        <w:rPr>
+          <w:rFonts w:ascii="Times New Roman" w:cs="Times New Roman" w:eastAsia="Times New Roman" w:hAnsi="Times New Roman"/>
+          <w:b/>
+          <w:bCs/>
+          <w:sz w:val="26"/>
+          <w:szCs w:val="26"/>
+        </w:rPr>
+        <w:t xml:space="preserve">Ngày gửi thông báo đối thoại</w:t>
+      </w:r>
+      <w:r>
+        <w:rPr>
+          <w:rFonts w:ascii="Times New Roman" w:cs="Times New Roman" w:eastAsia="Times New Roman" w:hAnsi="Times New Roman"/>
+          <w:sz w:val="26"/>
+          <w:szCs w:val="26"/>
+        </w:rPr>
+        <w:t xml:space="preserve"> — phần mềm nhắc gửi thông báo trước ngày đối thoại ít nhất 05 ngày (k1 Điều 28 NĐ 124/2020 sửa bởi NĐ 155/2026), nút T24 soạn thông báo; ghi ngày gửi QĐ tạm đình chỉ, QĐ tiếp tục, QĐ đình chỉ — nhắc khi quá 03 ngày làm việc kể từ ngày ban hành (k1, k2 Điều 28b). Đơn lần hai có nút T25 (QĐ giải quyết khiếu nại lần hai, Mẫu 16 NĐ 124/2020; người giải quyết mặc định Chủ tịch UBND tỉnh — sửa nếu khác; thời hạn khởi kiện cán bộ ghi theo Luật Tố tụng hành chính).</w:t>
+      </w:r>
+    </w:p>
+    <w:p>
+      <w:pPr>
+        <w:pStyle w:val="ListParagraph"/>
+        <w:numPr>
+          <w:ilvl w:val="0"/>
+          <w:numId w:val="12"/>
+        </w:numPr>
+        <w:spacing w:after="100" w:line="300"/>
+        <w:jc w:val="both"/>
+      </w:pPr>
+      <w:r>
+        <w:rPr>
+          <w:rFonts w:ascii="Times New Roman" w:cs="Times New Roman" w:eastAsia="Times New Roman" w:hAnsi="Times New Roman"/>
+          <w:sz w:val="26"/>
+          <w:szCs w:val="26"/>
+        </w:rPr>
+        <w:t xml:space="preserve">Tổng quan dự án → thẻ </w:t>
+      </w:r>
+      <w:r>
+        <w:rPr>
+          <w:rFonts w:ascii="Times New Roman" w:cs="Times New Roman" w:eastAsia="Times New Roman" w:hAnsi="Times New Roman"/>
+          <w:b/>
+          <w:bCs/>
+          <w:sz w:val="26"/>
+          <w:szCs w:val="26"/>
+        </w:rPr>
+        <w:t xml:space="preserve">Khiếu nại, cưỡng chế</w:t>
+      </w:r>
+      <w:r>
+        <w:rPr>
+          <w:rFonts w:ascii="Times New Roman" w:cs="Times New Roman" w:eastAsia="Times New Roman" w:hAnsi="Times New Roman"/>
+          <w:sz w:val="26"/>
+          <w:szCs w:val="26"/>
+        </w:rPr>
+        <w:t xml:space="preserve">: số đơn theo trạng thái (gồm tạm đình chỉ), đơn quá hạn, đơn gửi văn bản chậm, hồ sơ cưỡng chế; bấm tên hộ để mở thẻ Khiếu nại; </w:t>
+      </w:r>
+      <w:r>
+        <w:rPr>
+          <w:rFonts w:ascii="Times New Roman" w:cs="Times New Roman" w:eastAsia="Times New Roman" w:hAnsi="Times New Roman"/>
+          <w:b/>
+          <w:bCs/>
+          <w:sz w:val="26"/>
+          <w:szCs w:val="26"/>
+        </w:rPr>
+        <w:t xml:space="preserve">Xuất Excel</w:t>
+      </w:r>
+      <w:r>
+        <w:rPr>
+          <w:rFonts w:ascii="Times New Roman" w:cs="Times New Roman" w:eastAsia="Times New Roman" w:hAnsi="Times New Roman"/>
+          <w:sz w:val="26"/>
+          <w:szCs w:val="26"/>
+        </w:rPr>
+        <w:t xml:space="preserve"> (tổng hợp, từng đơn, từng hồ sơ cưỡng chế, kèm căn cứ). Số đơn tạm đình chỉ có trong gói gửi tỉnh.</w:t>
+      </w:r>
+    </w:p>
+    <w:p>
+      <w:pPr>
+        <w:pStyle w:val="ListParagraph"/>
+        <w:numPr>
+          <w:ilvl w:val="0"/>
+          <w:numId w:val="12"/>
+        </w:numPr>
+        <w:spacing w:after="100" w:line="300"/>
+        <w:jc w:val="both"/>
+      </w:pPr>
+      <w:r>
+        <w:rPr>
+          <w:rFonts w:ascii="Times New Roman" w:cs="Times New Roman" w:eastAsia="Times New Roman" w:hAnsi="Times New Roman"/>
           <w:b/>
           <w:bCs/>
           <w:sz w:val="26"/>
@@ -4858,7 +5042,7 @@
         <w:sz w:val="20"/>
         <w:szCs w:val="20"/>
       </w:rPr>
-      <w:t xml:space="preserve">Hướng dẫn sử dụng Phần mềm GPMB Sơn La – phiên bản 1.0.21</w:t>
+      <w:t xml:space="preserve">Hướng dẫn sử dụng Phần mềm GPMB Sơn La – phiên bản 1.1.0</w:t>
     </w:r>
   </w:p>
 </w:hdr>

</xml_diff>

<commit_message>
Phát hành 1.2.0: QĐ 27/2026, nhắc hạn Sổ tay, sổ văn bản đi ghi tay, mẫu 14/R5 theo Mẫu 44, xem trước Excel, báo cáo tháng; tài liệu, hướng dẫn Word, video 5, ca Playwright
Co-Authored-By: Claude Opus 5.5 <noreply@anthropic.com>
Claude-Session: https://claude.ai/code/session_01BZcswa4gE3voAhFCMjfJc5
</commit_message>
<xml_diff>
--- a/apps/desktop/public/huong-dan/Huong-dan-su-dung-GPMB.docx
+++ b/apps/desktop/public/huong-dan/Huong-dan-su-dung-GPMB.docx
@@ -93,7 +93,7 @@
           <w:sz w:val="26"/>
           <w:szCs w:val="26"/>
         </w:rPr>
-        <w:t xml:space="preserve">Phiên bản 1.1.0</w:t>
+        <w:t xml:space="preserve">Phiên bản 1.2.0</w:t>
       </w:r>
     </w:p>
     <w:p>
@@ -2923,7 +2923,7 @@
           <w:sz w:val="26"/>
           <w:szCs w:val="26"/>
         </w:rPr>
-        <w:t xml:space="preserve">: 22 mẫu Sổ tay, 25 mẫu theo văn bản thực tế (T1–T25), mẫu riêng của đơn vị; tự điền thông tin hộ, thửa, tài sản, số tiền theo kết quả tính.</w:t>
+        <w:t xml:space="preserve">: 22 mẫu Sổ tay, 28 mẫu theo văn bản thực tế (T1–T28), mẫu riêng của đơn vị; tự điền thông tin hộ, thửa, tài sản, số tiền theo kết quả tính.</w:t>
       </w:r>
     </w:p>
     <w:p>
@@ -3017,6 +3017,79 @@
           <w:sz w:val="26"/>
           <w:szCs w:val="26"/>
         </w:rPr>
+        <w:t xml:space="preserve">Từ bản 1.2.0: ô Số văn bản có nút </w:t>
+      </w:r>
+      <w:r>
+        <w:rPr>
+          <w:rFonts w:ascii="Times New Roman" w:cs="Times New Roman" w:eastAsia="Times New Roman" w:hAnsi="Times New Roman"/>
+          <w:b/>
+          <w:bCs/>
+          <w:sz w:val="26"/>
+          <w:szCs w:val="26"/>
+        </w:rPr>
+        <w:t xml:space="preserve">Số tiếp theo theo sổ</w:t>
+      </w:r>
+      <w:r>
+        <w:rPr>
+          <w:rFonts w:ascii="Times New Roman" w:cs="Times New Roman" w:eastAsia="Times New Roman" w:hAnsi="Times New Roman"/>
+          <w:sz w:val="26"/>
+          <w:szCs w:val="26"/>
+        </w:rPr>
+        <w:t xml:space="preserve">; số đã cấp (cùng ký hiệu, năm) được nhắc trong khung kiểm tra; tạo xong tự ghi </w:t>
+      </w:r>
+      <w:r>
+        <w:rPr>
+          <w:rFonts w:ascii="Times New Roman" w:cs="Times New Roman" w:eastAsia="Times New Roman" w:hAnsi="Times New Roman"/>
+          <w:b/>
+          <w:bCs/>
+          <w:sz w:val="26"/>
+          <w:szCs w:val="26"/>
+        </w:rPr>
+        <w:t xml:space="preserve">Sổ văn bản đi</w:t>
+      </w:r>
+      <w:r>
+        <w:rPr>
+          <w:rFonts w:ascii="Times New Roman" w:cs="Times New Roman" w:eastAsia="Times New Roman" w:hAnsi="Times New Roman"/>
+          <w:sz w:val="26"/>
+          <w:szCs w:val="26"/>
+        </w:rPr>
+        <w:t xml:space="preserve"> (dự án → Tài liệu, văn bản; xuất Excel). Nút </w:t>
+      </w:r>
+      <w:r>
+        <w:rPr>
+          <w:rFonts w:ascii="Times New Roman" w:cs="Times New Roman" w:eastAsia="Times New Roman" w:hAnsi="Times New Roman"/>
+          <w:b/>
+          <w:bCs/>
+          <w:sz w:val="26"/>
+          <w:szCs w:val="26"/>
+        </w:rPr>
+        <w:t xml:space="preserve">Xem trước</w:t>
+      </w:r>
+      <w:r>
+        <w:rPr>
+          <w:rFonts w:ascii="Times New Roman" w:cs="Times New Roman" w:eastAsia="Times New Roman" w:hAnsi="Times New Roman"/>
+          <w:sz w:val="26"/>
+          <w:szCs w:val="26"/>
+        </w:rPr>
+        <w:t xml:space="preserve"> để soát nội dung trước khi tải. T26: QĐ phê duyệt phương án theo Mẫu 44 NĐ 151/2025; T27, T28: biên bản cưỡng chế, biên bản bảo quản tài sản.</w:t>
+      </w:r>
+    </w:p>
+    <w:p>
+      <w:pPr>
+        <w:pStyle w:val="ListParagraph"/>
+        <w:numPr>
+          <w:ilvl w:val="0"/>
+          <w:numId w:val="10"/>
+        </w:numPr>
+        <w:spacing w:after="100" w:line="300"/>
+        <w:jc w:val="both"/>
+      </w:pPr>
+      <w:r>
+        <w:rPr>
+          <w:rFonts w:ascii="Times New Roman" w:cs="Times New Roman" w:eastAsia="Times New Roman" w:hAnsi="Times New Roman"/>
+          <w:sz w:val="26"/>
+          <w:szCs w:val="26"/>
+        </w:rPr>
         <w:t xml:space="preserve">Biên bản bàn giao đất trên thực địa (T23, Mẫu 06 NĐ 102/2024) tạo xong thì phần mềm ghi mốc ở thẻ </w:t>
       </w:r>
       <w:r>
@@ -3073,6 +3146,80 @@
           <w:szCs w:val="26"/>
         </w:rPr>
         <w:t xml:space="preserve">Trước khi tạo văn bản, phần mềm hiện bảng kiểm tra thống nhất (tên đơn vị hành chính, chức danh…) — chỉ nhắc.</w:t>
+      </w:r>
+    </w:p>
+    <w:p>
+      <w:pPr>
+        <w:pStyle w:val="ListParagraph"/>
+        <w:numPr>
+          <w:ilvl w:val="0"/>
+          <w:numId w:val="10"/>
+        </w:numPr>
+        <w:spacing w:after="100" w:line="300"/>
+        <w:jc w:val="both"/>
+      </w:pPr>
+      <w:r>
+        <w:rPr>
+          <w:rFonts w:ascii="Times New Roman" w:cs="Times New Roman" w:eastAsia="Times New Roman" w:hAnsi="Times New Roman"/>
+          <w:sz w:val="26"/>
+          <w:szCs w:val="26"/>
+        </w:rPr>
+        <w:t xml:space="preserve">Từ bản 1.2.0 (đợt 2): căn cứ mặc định có QĐ 27/2026/QĐ-UBND; mô tả mẫu ghi thẩm quyền Chủ tịch UBND cấp xã theo Phụ lục II; ký từ 01/3/2027 khung kiểm tra báo QĐ 27 hết hiệu lực. Mẫu 14 tách Điều 1 theo Mẫu 44 NĐ 151/2025. Văn bản soạn ngoài phần mềm: Sổ văn bản đi → </w:t>
+      </w:r>
+      <w:r>
+        <w:rPr>
+          <w:rFonts w:ascii="Times New Roman" w:cs="Times New Roman" w:eastAsia="Times New Roman" w:hAnsi="Times New Roman"/>
+          <w:b/>
+          <w:bCs/>
+          <w:sz w:val="26"/>
+          <w:szCs w:val="26"/>
+        </w:rPr>
+        <w:t xml:space="preserve">Ghi tay</w:t>
+      </w:r>
+      <w:r>
+        <w:rPr>
+          <w:rFonts w:ascii="Times New Roman" w:cs="Times New Roman" w:eastAsia="Times New Roman" w:hAnsi="Times New Roman"/>
+          <w:sz w:val="26"/>
+          <w:szCs w:val="26"/>
+        </w:rPr>
+        <w:t xml:space="preserve">. Biểu Excel phương án: Thêm → Biểu mẫu Excel → </w:t>
+      </w:r>
+      <w:r>
+        <w:rPr>
+          <w:rFonts w:ascii="Times New Roman" w:cs="Times New Roman" w:eastAsia="Times New Roman" w:hAnsi="Times New Roman"/>
+          <w:b/>
+          <w:bCs/>
+          <w:sz w:val="26"/>
+          <w:szCs w:val="26"/>
+        </w:rPr>
+        <w:t xml:space="preserve">Xem trước</w:t>
+      </w:r>
+      <w:r>
+        <w:rPr>
+          <w:rFonts w:ascii="Times New Roman" w:cs="Times New Roman" w:eastAsia="Times New Roman" w:hAnsi="Times New Roman"/>
+          <w:sz w:val="26"/>
+          <w:szCs w:val="26"/>
+        </w:rPr>
+        <w:t xml:space="preserve">.</w:t>
+      </w:r>
+    </w:p>
+    <w:p>
+      <w:pPr>
+        <w:pStyle w:val="ListParagraph"/>
+        <w:numPr>
+          <w:ilvl w:val="0"/>
+          <w:numId w:val="10"/>
+        </w:numPr>
+        <w:spacing w:after="100" w:line="300"/>
+        <w:jc w:val="both"/>
+      </w:pPr>
+      <w:r>
+        <w:rPr>
+          <w:rFonts w:ascii="Times New Roman" w:cs="Times New Roman" w:eastAsia="Times New Roman" w:hAnsi="Times New Roman"/>
+          <w:sz w:val="26"/>
+          <w:szCs w:val="26"/>
+        </w:rPr>
+        <w:t xml:space="preserve">Nhắc hạn theo Sổ tay (1.2.0): Cập nhật tiến độ → bước 2, 3 hiện hạn 03/02 ngày; hồ sơ cưỡng chế kiểm đếm ghi vận động trước kiểm đếm, ngày nhận đề nghị, ngày trình → phần mềm nhắc hạn trình 03, ban hành 02 ngày làm việc, giao quyết định cưỡng chế, vận động 05 ngày làm việc sau giao.</w:t>
       </w:r>
     </w:p>
     <w:p>
@@ -4020,6 +4167,25 @@
     </w:p>
     <w:p>
       <w:pPr>
+        <w:pStyle w:val="ListParagraph"/>
+        <w:numPr>
+          <w:ilvl w:val="0"/>
+          <w:numId w:val="13"/>
+        </w:numPr>
+        <w:spacing w:after="100" w:line="300"/>
+        <w:jc w:val="both"/>
+      </w:pPr>
+      <w:r>
+        <w:rPr>
+          <w:rFonts w:ascii="Times New Roman" w:cs="Times New Roman" w:eastAsia="Times New Roman" w:hAnsi="Times New Roman"/>
+          <w:sz w:val="26"/>
+          <w:szCs w:val="26"/>
+        </w:rPr>
+        <w:t xml:space="preserve">Từ bản 1.2.0: báo cáo Word cấp xã có mục Tiến độ theo tháng (biểu đồ tỷ lệ hộ đã duyệt phương án, đã bàn giao), đơn quá hạn, lịch cưỡng chế; máy tỉnh có biểu đồ đơn khiếu nại theo tháng (đơn mới, đã giải quyết, quá hạn), báo cáo tỉnh có lịch cưỡng chế (gói xã chỉ gửi ngày, loại — không tên hộ).</w:t>
+      </w:r>
+    </w:p>
+    <w:p>
+      <w:pPr>
         <w:keepNext/>
         <w:spacing w:before="160"/>
         <w:jc w:val="center"/>
@@ -5042,7 +5208,7 @@
         <w:sz w:val="20"/>
         <w:szCs w:val="20"/>
       </w:rPr>
-      <w:t xml:space="preserve">Hướng dẫn sử dụng Phần mềm GPMB Sơn La – phiên bản 1.1.0</w:t>
+      <w:t xml:space="preserve">Hướng dẫn sử dụng Phần mềm GPMB Sơn La – phiên bản 1.2.0</w:t>
     </w:r>
   </w:p>
 </w:hdr>

</xml_diff>

<commit_message>
1.3.0: hướng dẫn sử dụng Word chụp lại (Báo cáo phân cấp, Thẩm quyền phân cấp)
Co-Authored-By: Claude Opus 5.5 <noreply@anthropic.com>
Claude-Session: https://claude.ai/code/session_01BZcswa4gE3voAhFCMjfJc5
</commit_message>
<xml_diff>
--- a/apps/desktop/public/huong-dan/Huong-dan-su-dung-GPMB.docx
+++ b/apps/desktop/public/huong-dan/Huong-dan-su-dung-GPMB.docx
@@ -93,7 +93,7 @@
           <w:sz w:val="26"/>
           <w:szCs w:val="26"/>
         </w:rPr>
-        <w:t xml:space="preserve">Phiên bản 1.2.0</w:t>
+        <w:t xml:space="preserve">Phiên bản 1.3.0</w:t>
       </w:r>
     </w:p>
     <w:p>
@@ -3219,6 +3219,43 @@
           <w:sz w:val="26"/>
           <w:szCs w:val="26"/>
         </w:rPr>
+        <w:t xml:space="preserve">Từ bản 1.3.0: mẫu T29 (Hội đồng bồi thường), T30 (Ban cưỡng chế kiểm đếm bắt buộc), T31 (giá bán nhà ở tái định cư); nút </w:t>
+      </w:r>
+      <w:r>
+        <w:rPr>
+          <w:rFonts w:ascii="Times New Roman" w:cs="Times New Roman" w:eastAsia="Times New Roman" w:hAnsi="Times New Roman"/>
+          <w:b/>
+          <w:bCs/>
+          <w:sz w:val="26"/>
+          <w:szCs w:val="26"/>
+        </w:rPr>
+        <w:t xml:space="preserve">Phiếu kiểm tra (Word)</w:t>
+      </w:r>
+      <w:r>
+        <w:rPr>
+          <w:rFonts w:ascii="Times New Roman" w:cs="Times New Roman" w:eastAsia="Times New Roman" w:hAnsi="Times New Roman"/>
+          <w:sz w:val="26"/>
+          <w:szCs w:val="26"/>
+        </w:rPr>
+        <w:t xml:space="preserve"> liệt kê điểm cần xem, căn cứ, thẩm quyền để in kèm phiếu trình; số, ngày QĐ cưỡng chế (Mẫu 07, 22), QĐ thành lập Ban (T16) đã ghi số tự điền vào hồ sơ cưỡng chế.</w:t>
+      </w:r>
+    </w:p>
+    <w:p>
+      <w:pPr>
+        <w:pStyle w:val="ListParagraph"/>
+        <w:numPr>
+          <w:ilvl w:val="0"/>
+          <w:numId w:val="10"/>
+        </w:numPr>
+        <w:spacing w:after="100" w:line="300"/>
+        <w:jc w:val="both"/>
+      </w:pPr>
+      <w:r>
+        <w:rPr>
+          <w:rFonts w:ascii="Times New Roman" w:cs="Times New Roman" w:eastAsia="Times New Roman" w:hAnsi="Times New Roman"/>
+          <w:sz w:val="26"/>
+          <w:szCs w:val="26"/>
+        </w:rPr>
         <w:t xml:space="preserve">Nhắc hạn theo Sổ tay (1.2.0): Cập nhật tiến độ → bước 2, 3 hiện hạn 03/02 ngày; hồ sơ cưỡng chế kiểm đếm ghi vận động trước kiểm đếm, ngày nhận đề nghị, ngày trình → phần mềm nhắc hạn trình 03, ban hành 02 ngày làm việc, giao quyết định cưỡng chế, vận động 05 ngày làm việc sau giao.</w:t>
       </w:r>
     </w:p>
@@ -4181,6 +4218,43 @@
           <w:sz w:val="26"/>
           <w:szCs w:val="26"/>
         </w:rPr>
+        <w:t xml:space="preserve">Báo cáo phân cấp 06 tháng (1.3.0): Báo cáo tổng hợp → </w:t>
+      </w:r>
+      <w:r>
+        <w:rPr>
+          <w:rFonts w:ascii="Times New Roman" w:cs="Times New Roman" w:eastAsia="Times New Roman" w:hAnsi="Times New Roman"/>
+          <w:b/>
+          <w:bCs/>
+          <w:sz w:val="26"/>
+          <w:szCs w:val="26"/>
+        </w:rPr>
+        <w:t xml:space="preserve">Báo cáo phân cấp (06 tháng)…</w:t>
+      </w:r>
+      <w:r>
+        <w:rPr>
+          <w:rFonts w:ascii="Times New Roman" w:cs="Times New Roman" w:eastAsia="Times New Roman" w:hAnsi="Times New Roman"/>
+          <w:sz w:val="26"/>
+          <w:szCs w:val="26"/>
+        </w:rPr>
+        <w:t xml:space="preserve"> — trước 15/6 và 15/12 (khoản 2 Điều 4 QĐ 27/2026/QĐ-UBND); số văn bản theo nhiệm vụ lấy từ Sổ văn bản đi. Máy tỉnh có thẻ Kết quả phân cấp theo xã, lịch cưỡng chế toàn tỉnh.</w:t>
+      </w:r>
+    </w:p>
+    <w:p>
+      <w:pPr>
+        <w:pStyle w:val="ListParagraph"/>
+        <w:numPr>
+          <w:ilvl w:val="0"/>
+          <w:numId w:val="13"/>
+        </w:numPr>
+        <w:spacing w:after="100" w:line="300"/>
+        <w:jc w:val="both"/>
+      </w:pPr>
+      <w:r>
+        <w:rPr>
+          <w:rFonts w:ascii="Times New Roman" w:cs="Times New Roman" w:eastAsia="Times New Roman" w:hAnsi="Times New Roman"/>
+          <w:sz w:val="26"/>
+          <w:szCs w:val="26"/>
+        </w:rPr>
         <w:t xml:space="preserve">Từ bản 1.2.0: báo cáo Word cấp xã có mục Tiến độ theo tháng (biểu đồ tỷ lệ hộ đã duyệt phương án, đã bàn giao), đơn quá hạn, lịch cưỡng chế; máy tỉnh có biểu đồ đơn khiếu nại theo tháng (đơn mới, đã giải quyết, quá hạn), báo cáo tỉnh có lịch cưỡng chế (gói xã chỉ gửi ngày, loại — không tên hộ).</w:t>
       </w:r>
     </w:p>
@@ -4307,211 +4381,7 @@
           <w:sz w:val="24"/>
           <w:szCs w:val="24"/>
         </w:rPr>
-        <w:t xml:space="preserve">Hình 22. Gửi tỉnh, tổng hợp tỉnh</w:t>
-      </w:r>
-    </w:p>
-    <w:p>
-      <w:pPr>
-        <w:spacing w:after="120"/>
-        <w:jc w:val="both"/>
-      </w:pPr>
-      <w:r>
-        <w:rPr>
-          <w:rFonts w:ascii="Times New Roman" w:cs="Times New Roman" w:eastAsia="Times New Roman" w:hAnsi="Times New Roman"/>
-          <w:b/>
-          <w:bCs/>
-          <w:i/>
-          <w:iCs/>
-          <w:sz w:val="26"/>
-          <w:szCs w:val="26"/>
-        </w:rPr>
-        <w:t xml:space="preserve">Lưu ý: </w:t>
-      </w:r>
-      <w:r>
-        <w:rPr>
-          <w:rFonts w:ascii="Times New Roman" w:cs="Times New Roman" w:eastAsia="Times New Roman" w:hAnsi="Times New Roman"/>
-          <w:i/>
-          <w:iCs/>
-          <w:sz w:val="26"/>
-          <w:szCs w:val="26"/>
-        </w:rPr>
-        <w:t xml:space="preserve">Dự án tập huấn không bao giờ được đưa vào gói gửi tỉnh.</w:t>
-      </w:r>
-    </w:p>
-    <w:p>
-      <w:pPr>
-        <w:pStyle w:val="Heading1"/>
-        <w:pageBreakBefore/>
-        <w:spacing w:after="200"/>
-      </w:pPr>
-      <w:r>
-        <w:rPr>
-          <w:rFonts w:ascii="Times New Roman" w:cs="Times New Roman" w:eastAsia="Times New Roman" w:hAnsi="Times New Roman"/>
-          <w:b/>
-          <w:bCs/>
-          <w:sz w:val="28"/>
-          <w:szCs w:val="28"/>
-        </w:rPr>
-        <w:t xml:space="preserve">13. SAO LƯU, BẢO MẬT, MẠNG NỘI BỘ, CẬP NHẬT</w:t>
-      </w:r>
-    </w:p>
-    <w:p>
-      <w:pPr>
-        <w:pStyle w:val="ListParagraph"/>
-        <w:numPr>
-          <w:ilvl w:val="0"/>
-          <w:numId w:val="14"/>
-        </w:numPr>
-        <w:spacing w:after="100" w:line="300"/>
-        <w:jc w:val="both"/>
-      </w:pPr>
-      <w:r>
-        <w:rPr>
-          <w:rFonts w:ascii="Times New Roman" w:cs="Times New Roman" w:eastAsia="Times New Roman" w:hAnsi="Times New Roman"/>
-          <w:sz w:val="26"/>
-          <w:szCs w:val="26"/>
-        </w:rPr>
-        <w:t xml:space="preserve">Nút </w:t>
-      </w:r>
-      <w:r>
-        <w:rPr>
-          <w:rFonts w:ascii="Times New Roman" w:cs="Times New Roman" w:eastAsia="Times New Roman" w:hAnsi="Times New Roman"/>
-          <w:b/>
-          <w:bCs/>
-          <w:sz w:val="26"/>
-          <w:szCs w:val="26"/>
-        </w:rPr>
-        <w:t xml:space="preserve">Sao lưu, khôi phục</w:t>
-      </w:r>
-      <w:r>
-        <w:rPr>
-          <w:rFonts w:ascii="Times New Roman" w:cs="Times New Roman" w:eastAsia="Times New Roman" w:hAnsi="Times New Roman"/>
-          <w:sz w:val="26"/>
-          <w:szCs w:val="26"/>
-        </w:rPr>
-        <w:t xml:space="preserve">: tạo bản sao lưu mã hóa (.gpmb) có mật khẩu; bật tự động sao lưu; phần mềm nhắc cất bản sao lưu ra thiết bị khác (USB, ổ mạng) theo chu kỳ đơn vị đặt.</w:t>
-      </w:r>
-    </w:p>
-    <w:p>
-      <w:pPr>
-        <w:pStyle w:val="ListParagraph"/>
-        <w:numPr>
-          <w:ilvl w:val="0"/>
-          <w:numId w:val="14"/>
-        </w:numPr>
-        <w:spacing w:after="100" w:line="300"/>
-        <w:jc w:val="both"/>
-      </w:pPr>
-      <w:r>
-        <w:rPr>
-          <w:rFonts w:ascii="Times New Roman" w:cs="Times New Roman" w:eastAsia="Times New Roman" w:hAnsi="Times New Roman"/>
-          <w:sz w:val="26"/>
-          <w:szCs w:val="26"/>
-        </w:rPr>
-        <w:t xml:space="preserve">Cơ sở dữ liệu trên máy (máy đơn, máy chủ) được mã hóa; khóa do Windows giữ theo tài khoản máy — </w:t>
-      </w:r>
-      <w:r>
-        <w:rPr>
-          <w:rFonts w:ascii="Times New Roman" w:cs="Times New Roman" w:eastAsia="Times New Roman" w:hAnsi="Times New Roman"/>
-          <w:b/>
-          <w:bCs/>
-          <w:sz w:val="26"/>
-          <w:szCs w:val="26"/>
-        </w:rPr>
-        <w:t xml:space="preserve">cài lại Windows thì khôi phục từ tệp sao lưu</w:t>
-      </w:r>
-      <w:r>
-        <w:rPr>
-          <w:rFonts w:ascii="Times New Roman" w:cs="Times New Roman" w:eastAsia="Times New Roman" w:hAnsi="Times New Roman"/>
-          <w:sz w:val="26"/>
-          <w:szCs w:val="26"/>
-        </w:rPr>
-        <w:t xml:space="preserve">.</w:t>
-      </w:r>
-    </w:p>
-    <w:p>
-      <w:pPr>
-        <w:pStyle w:val="ListParagraph"/>
-        <w:numPr>
-          <w:ilvl w:val="0"/>
-          <w:numId w:val="14"/>
-        </w:numPr>
-        <w:spacing w:after="100" w:line="300"/>
-        <w:jc w:val="both"/>
-      </w:pPr>
-      <w:r>
-        <w:rPr>
-          <w:rFonts w:ascii="Times New Roman" w:cs="Times New Roman" w:eastAsia="Times New Roman" w:hAnsi="Times New Roman"/>
-          <w:sz w:val="26"/>
-          <w:szCs w:val="26"/>
-        </w:rPr>
-        <w:t xml:space="preserve">Mạng nội bộ: máy chủ đặt IP tĩnh, mở cổng 47800 trong mạng riêng; máy trạm đối chiếu vân tay chứng chỉ lần đầu. Nâng cấp máy chủ trước, máy trạm sau.</w:t>
-      </w:r>
-    </w:p>
-    <w:p>
-      <w:pPr>
-        <w:pStyle w:val="ListParagraph"/>
-        <w:numPr>
-          <w:ilvl w:val="0"/>
-          <w:numId w:val="14"/>
-        </w:numPr>
-        <w:spacing w:after="100" w:line="300"/>
-        <w:jc w:val="both"/>
-      </w:pPr>
-      <w:r>
-        <w:rPr>
-          <w:rFonts w:ascii="Times New Roman" w:cs="Times New Roman" w:eastAsia="Times New Roman" w:hAnsi="Times New Roman"/>
-          <w:sz w:val="26"/>
-          <w:szCs w:val="26"/>
-        </w:rPr>
-        <w:t xml:space="preserve">Cập nhật: Giới thiệu, bản quyền → kiểm tra bản mới, cài trong phần mềm.</w:t>
-      </w:r>
-    </w:p>
-    <w:p>
-      <w:pPr>
-        <w:pStyle w:val="ListParagraph"/>
-        <w:numPr>
-          <w:ilvl w:val="0"/>
-          <w:numId w:val="14"/>
-        </w:numPr>
-        <w:spacing w:after="100" w:line="300"/>
-        <w:jc w:val="both"/>
-      </w:pPr>
-      <w:r>
-        <w:rPr>
-          <w:rFonts w:ascii="Times New Roman" w:cs="Times New Roman" w:eastAsia="Times New Roman" w:hAnsi="Times New Roman"/>
-          <w:b/>
-          <w:bCs/>
-          <w:sz w:val="26"/>
-          <w:szCs w:val="26"/>
-        </w:rPr>
-        <w:t xml:space="preserve">Nhật ký sự cố</w:t>
-      </w:r>
-      <w:r>
-        <w:rPr>
-          <w:rFonts w:ascii="Times New Roman" w:cs="Times New Roman" w:eastAsia="Times New Roman" w:hAnsi="Times New Roman"/>
-          <w:sz w:val="26"/>
-          <w:szCs w:val="26"/>
-        </w:rPr>
-        <w:t xml:space="preserve"> (Giới thiệu, bản quyền): khi cần hỗ trợ, bấm </w:t>
-      </w:r>
-      <w:r>
-        <w:rPr>
-          <w:rFonts w:ascii="Times New Roman" w:cs="Times New Roman" w:eastAsia="Times New Roman" w:hAnsi="Times New Roman"/>
-          <w:b/>
-          <w:bCs/>
-          <w:sz w:val="26"/>
-          <w:szCs w:val="26"/>
-        </w:rPr>
-        <w:t xml:space="preserve">Xuất nhật ký lỗi</w:t>
-      </w:r>
-      <w:r>
-        <w:rPr>
-          <w:rFonts w:ascii="Times New Roman" w:cs="Times New Roman" w:eastAsia="Times New Roman" w:hAnsi="Times New Roman"/>
-          <w:sz w:val="26"/>
-          <w:szCs w:val="26"/>
-        </w:rPr>
-        <w:t xml:space="preserve"> và gửi tệp .txt cho tác giả — tệp chỉ có thông điệp kỹ thuật, đã che số định danh, điện thoại; phần mềm không tự gửi.</w:t>
+        <w:t xml:space="preserve">Hình 22. Báo cáo kết quả thực hiện nhiệm vụ được phân cấp (06 tháng)</w:t>
       </w:r>
     </w:p>
     <w:p>
@@ -4574,7 +4444,211 @@
           <w:sz w:val="24"/>
           <w:szCs w:val="24"/>
         </w:rPr>
-        <w:t xml:space="preserve">Hình 23. Sao lưu, khôi phục dữ liệu</w:t>
+        <w:t xml:space="preserve">Hình 23. Gửi tỉnh, tổng hợp tỉnh</w:t>
+      </w:r>
+    </w:p>
+    <w:p>
+      <w:pPr>
+        <w:spacing w:after="120"/>
+        <w:jc w:val="both"/>
+      </w:pPr>
+      <w:r>
+        <w:rPr>
+          <w:rFonts w:ascii="Times New Roman" w:cs="Times New Roman" w:eastAsia="Times New Roman" w:hAnsi="Times New Roman"/>
+          <w:b/>
+          <w:bCs/>
+          <w:i/>
+          <w:iCs/>
+          <w:sz w:val="26"/>
+          <w:szCs w:val="26"/>
+        </w:rPr>
+        <w:t xml:space="preserve">Lưu ý: </w:t>
+      </w:r>
+      <w:r>
+        <w:rPr>
+          <w:rFonts w:ascii="Times New Roman" w:cs="Times New Roman" w:eastAsia="Times New Roman" w:hAnsi="Times New Roman"/>
+          <w:i/>
+          <w:iCs/>
+          <w:sz w:val="26"/>
+          <w:szCs w:val="26"/>
+        </w:rPr>
+        <w:t xml:space="preserve">Dự án tập huấn không bao giờ được đưa vào gói gửi tỉnh.</w:t>
+      </w:r>
+    </w:p>
+    <w:p>
+      <w:pPr>
+        <w:pStyle w:val="Heading1"/>
+        <w:pageBreakBefore/>
+        <w:spacing w:after="200"/>
+      </w:pPr>
+      <w:r>
+        <w:rPr>
+          <w:rFonts w:ascii="Times New Roman" w:cs="Times New Roman" w:eastAsia="Times New Roman" w:hAnsi="Times New Roman"/>
+          <w:b/>
+          <w:bCs/>
+          <w:sz w:val="28"/>
+          <w:szCs w:val="28"/>
+        </w:rPr>
+        <w:t xml:space="preserve">13. SAO LƯU, BẢO MẬT, MẠNG NỘI BỘ, CẬP NHẬT</w:t>
+      </w:r>
+    </w:p>
+    <w:p>
+      <w:pPr>
+        <w:pStyle w:val="ListParagraph"/>
+        <w:numPr>
+          <w:ilvl w:val="0"/>
+          <w:numId w:val="14"/>
+        </w:numPr>
+        <w:spacing w:after="100" w:line="300"/>
+        <w:jc w:val="both"/>
+      </w:pPr>
+      <w:r>
+        <w:rPr>
+          <w:rFonts w:ascii="Times New Roman" w:cs="Times New Roman" w:eastAsia="Times New Roman" w:hAnsi="Times New Roman"/>
+          <w:sz w:val="26"/>
+          <w:szCs w:val="26"/>
+        </w:rPr>
+        <w:t xml:space="preserve">Nút </w:t>
+      </w:r>
+      <w:r>
+        <w:rPr>
+          <w:rFonts w:ascii="Times New Roman" w:cs="Times New Roman" w:eastAsia="Times New Roman" w:hAnsi="Times New Roman"/>
+          <w:b/>
+          <w:bCs/>
+          <w:sz w:val="26"/>
+          <w:szCs w:val="26"/>
+        </w:rPr>
+        <w:t xml:space="preserve">Sao lưu, khôi phục</w:t>
+      </w:r>
+      <w:r>
+        <w:rPr>
+          <w:rFonts w:ascii="Times New Roman" w:cs="Times New Roman" w:eastAsia="Times New Roman" w:hAnsi="Times New Roman"/>
+          <w:sz w:val="26"/>
+          <w:szCs w:val="26"/>
+        </w:rPr>
+        <w:t xml:space="preserve">: tạo bản sao lưu mã hóa (.gpmb) có mật khẩu; bật tự động sao lưu; phần mềm nhắc cất bản sao lưu ra thiết bị khác (USB, ổ mạng) theo chu kỳ đơn vị đặt.</w:t>
+      </w:r>
+    </w:p>
+    <w:p>
+      <w:pPr>
+        <w:pStyle w:val="ListParagraph"/>
+        <w:numPr>
+          <w:ilvl w:val="0"/>
+          <w:numId w:val="14"/>
+        </w:numPr>
+        <w:spacing w:after="100" w:line="300"/>
+        <w:jc w:val="both"/>
+      </w:pPr>
+      <w:r>
+        <w:rPr>
+          <w:rFonts w:ascii="Times New Roman" w:cs="Times New Roman" w:eastAsia="Times New Roman" w:hAnsi="Times New Roman"/>
+          <w:sz w:val="26"/>
+          <w:szCs w:val="26"/>
+        </w:rPr>
+        <w:t xml:space="preserve">Cơ sở dữ liệu trên máy (máy đơn, máy chủ) được mã hóa; khóa do Windows giữ theo tài khoản máy — </w:t>
+      </w:r>
+      <w:r>
+        <w:rPr>
+          <w:rFonts w:ascii="Times New Roman" w:cs="Times New Roman" w:eastAsia="Times New Roman" w:hAnsi="Times New Roman"/>
+          <w:b/>
+          <w:bCs/>
+          <w:sz w:val="26"/>
+          <w:szCs w:val="26"/>
+        </w:rPr>
+        <w:t xml:space="preserve">cài lại Windows thì khôi phục từ tệp sao lưu</w:t>
+      </w:r>
+      <w:r>
+        <w:rPr>
+          <w:rFonts w:ascii="Times New Roman" w:cs="Times New Roman" w:eastAsia="Times New Roman" w:hAnsi="Times New Roman"/>
+          <w:sz w:val="26"/>
+          <w:szCs w:val="26"/>
+        </w:rPr>
+        <w:t xml:space="preserve">.</w:t>
+      </w:r>
+    </w:p>
+    <w:p>
+      <w:pPr>
+        <w:pStyle w:val="ListParagraph"/>
+        <w:numPr>
+          <w:ilvl w:val="0"/>
+          <w:numId w:val="14"/>
+        </w:numPr>
+        <w:spacing w:after="100" w:line="300"/>
+        <w:jc w:val="both"/>
+      </w:pPr>
+      <w:r>
+        <w:rPr>
+          <w:rFonts w:ascii="Times New Roman" w:cs="Times New Roman" w:eastAsia="Times New Roman" w:hAnsi="Times New Roman"/>
+          <w:sz w:val="26"/>
+          <w:szCs w:val="26"/>
+        </w:rPr>
+        <w:t xml:space="preserve">Mạng nội bộ: máy chủ đặt IP tĩnh, mở cổng 47800 trong mạng riêng; máy trạm đối chiếu vân tay chứng chỉ lần đầu. Nâng cấp máy chủ trước, máy trạm sau.</w:t>
+      </w:r>
+    </w:p>
+    <w:p>
+      <w:pPr>
+        <w:pStyle w:val="ListParagraph"/>
+        <w:numPr>
+          <w:ilvl w:val="0"/>
+          <w:numId w:val="14"/>
+        </w:numPr>
+        <w:spacing w:after="100" w:line="300"/>
+        <w:jc w:val="both"/>
+      </w:pPr>
+      <w:r>
+        <w:rPr>
+          <w:rFonts w:ascii="Times New Roman" w:cs="Times New Roman" w:eastAsia="Times New Roman" w:hAnsi="Times New Roman"/>
+          <w:sz w:val="26"/>
+          <w:szCs w:val="26"/>
+        </w:rPr>
+        <w:t xml:space="preserve">Cập nhật: Giới thiệu, bản quyền → kiểm tra bản mới, cài trong phần mềm.</w:t>
+      </w:r>
+    </w:p>
+    <w:p>
+      <w:pPr>
+        <w:pStyle w:val="ListParagraph"/>
+        <w:numPr>
+          <w:ilvl w:val="0"/>
+          <w:numId w:val="14"/>
+        </w:numPr>
+        <w:spacing w:after="100" w:line="300"/>
+        <w:jc w:val="both"/>
+      </w:pPr>
+      <w:r>
+        <w:rPr>
+          <w:rFonts w:ascii="Times New Roman" w:cs="Times New Roman" w:eastAsia="Times New Roman" w:hAnsi="Times New Roman"/>
+          <w:b/>
+          <w:bCs/>
+          <w:sz w:val="26"/>
+          <w:szCs w:val="26"/>
+        </w:rPr>
+        <w:t xml:space="preserve">Nhật ký sự cố</w:t>
+      </w:r>
+      <w:r>
+        <w:rPr>
+          <w:rFonts w:ascii="Times New Roman" w:cs="Times New Roman" w:eastAsia="Times New Roman" w:hAnsi="Times New Roman"/>
+          <w:sz w:val="26"/>
+          <w:szCs w:val="26"/>
+        </w:rPr>
+        <w:t xml:space="preserve"> (Giới thiệu, bản quyền): khi cần hỗ trợ, bấm </w:t>
+      </w:r>
+      <w:r>
+        <w:rPr>
+          <w:rFonts w:ascii="Times New Roman" w:cs="Times New Roman" w:eastAsia="Times New Roman" w:hAnsi="Times New Roman"/>
+          <w:b/>
+          <w:bCs/>
+          <w:sz w:val="26"/>
+          <w:szCs w:val="26"/>
+        </w:rPr>
+        <w:t xml:space="preserve">Xuất nhật ký lỗi</w:t>
+      </w:r>
+      <w:r>
+        <w:rPr>
+          <w:rFonts w:ascii="Times New Roman" w:cs="Times New Roman" w:eastAsia="Times New Roman" w:hAnsi="Times New Roman"/>
+          <w:sz w:val="26"/>
+          <w:szCs w:val="26"/>
+        </w:rPr>
+        <w:t xml:space="preserve"> và gửi tệp .txt cho tác giả — tệp chỉ có thông điệp kỹ thuật, đã che số định danh, điện thoại; phần mềm không tự gửi.</w:t>
       </w:r>
     </w:p>
     <w:p>
@@ -4637,7 +4711,7 @@
           <w:sz w:val="24"/>
           <w:szCs w:val="24"/>
         </w:rPr>
-        <w:t xml:space="preserve">Hình 24. Cài đặt chung — lịch ngày nghỉ</w:t>
+        <w:t xml:space="preserve">Hình 24. Sao lưu, khôi phục dữ liệu</w:t>
       </w:r>
     </w:p>
     <w:p>
@@ -4700,150 +4774,7 @@
           <w:sz w:val="24"/>
           <w:szCs w:val="24"/>
         </w:rPr>
-        <w:t xml:space="preserve">Hình 25. Giới thiệu, bản quyền — cập nhật, nhật ký sự cố</w:t>
-      </w:r>
-    </w:p>
-    <w:p>
-      <w:pPr>
-        <w:pStyle w:val="Heading1"/>
-        <w:pageBreakBefore/>
-        <w:spacing w:after="200"/>
-      </w:pPr>
-      <w:r>
-        <w:rPr>
-          <w:rFonts w:ascii="Times New Roman" w:cs="Times New Roman" w:eastAsia="Times New Roman" w:hAnsi="Times New Roman"/>
-          <w:b/>
-          <w:bCs/>
-          <w:sz w:val="28"/>
-          <w:szCs w:val="28"/>
-        </w:rPr>
-        <w:t xml:space="preserve">14. DỰ ÁN TẬP HUẤN</w:t>
-      </w:r>
-    </w:p>
-    <w:p>
-      <w:pPr>
-        <w:spacing w:after="120" w:line="300"/>
-        <w:ind w:firstLine="567"/>
-        <w:jc w:val="both"/>
-      </w:pPr>
-      <w:r>
-        <w:rPr>
-          <w:rFonts w:ascii="Times New Roman" w:cs="Times New Roman" w:eastAsia="Times New Roman" w:hAnsi="Times New Roman"/>
-          <w:sz w:val="26"/>
-          <w:szCs w:val="26"/>
-        </w:rPr>
-        <w:t xml:space="preserve">Dùng để tập huấn cán bộ: 6 hộ ở các giai đoạn khác nhau, bản đồ DXF giả lập 18 thửa có ranh GPMB, một đơn khiếu nại mẫu, một hộ có vướng mắc. Không có thông tin cá nhân thật.</w:t>
-      </w:r>
-    </w:p>
-    <w:p>
-      <w:pPr>
-        <w:pStyle w:val="ListParagraph"/>
-        <w:numPr>
-          <w:ilvl w:val="0"/>
-          <w:numId w:val="15"/>
-        </w:numPr>
-        <w:spacing w:after="100" w:line="300"/>
-        <w:jc w:val="both"/>
-      </w:pPr>
-      <w:r>
-        <w:rPr>
-          <w:rFonts w:ascii="Times New Roman" w:cs="Times New Roman" w:eastAsia="Times New Roman" w:hAnsi="Times New Roman"/>
-          <w:sz w:val="26"/>
-          <w:szCs w:val="26"/>
-        </w:rPr>
-        <w:t xml:space="preserve">Thanh bên → </w:t>
-      </w:r>
-      <w:r>
-        <w:rPr>
-          <w:rFonts w:ascii="Times New Roman" w:cs="Times New Roman" w:eastAsia="Times New Roman" w:hAnsi="Times New Roman"/>
-          <w:b/>
-          <w:bCs/>
-          <w:sz w:val="26"/>
-          <w:szCs w:val="26"/>
-        </w:rPr>
-        <w:t xml:space="preserve">Dự án</w:t>
-      </w:r>
-      <w:r>
-        <w:rPr>
-          <w:rFonts w:ascii="Times New Roman" w:cs="Times New Roman" w:eastAsia="Times New Roman" w:hAnsi="Times New Roman"/>
-          <w:sz w:val="26"/>
-          <w:szCs w:val="26"/>
-        </w:rPr>
-        <w:t xml:space="preserve"> → </w:t>
-      </w:r>
-      <w:r>
-        <w:rPr>
-          <w:rFonts w:ascii="Times New Roman" w:cs="Times New Roman" w:eastAsia="Times New Roman" w:hAnsi="Times New Roman"/>
-          <w:b/>
-          <w:bCs/>
-          <w:sz w:val="26"/>
-          <w:szCs w:val="26"/>
-        </w:rPr>
-        <w:t xml:space="preserve">Tạo dự án tập huấn</w:t>
-      </w:r>
-      <w:r>
-        <w:rPr>
-          <w:rFonts w:ascii="Times New Roman" w:cs="Times New Roman" w:eastAsia="Times New Roman" w:hAnsi="Times New Roman"/>
-          <w:sz w:val="26"/>
-          <w:szCs w:val="26"/>
-        </w:rPr>
-        <w:t xml:space="preserve">.</w:t>
-      </w:r>
-    </w:p>
-    <w:p>
-      <w:pPr>
-        <w:pStyle w:val="ListParagraph"/>
-        <w:numPr>
-          <w:ilvl w:val="0"/>
-          <w:numId w:val="15"/>
-        </w:numPr>
-        <w:spacing w:after="100" w:line="300"/>
-        <w:jc w:val="both"/>
-      </w:pPr>
-      <w:r>
-        <w:rPr>
-          <w:rFonts w:ascii="Times New Roman" w:cs="Times New Roman" w:eastAsia="Times New Roman" w:hAnsi="Times New Roman"/>
-          <w:sz w:val="26"/>
-          <w:szCs w:val="26"/>
-        </w:rPr>
-        <w:t xml:space="preserve">Bài tập gợi ý: (1) Bản đồ → chọn vùng ranh GPMB → xem diện tích thu hồi từng thửa; (2) hộ H03 → Thửa đất → chọn giá đất cho thửa HNK; (3) Soát, chốt, phê duyệt phương án; (4) soạn thông báo, quyết định; (5) ghi chi trả, bàn giao; (6) ghi khiếu nại, cưỡng chế; (7) xuất báo cáo.</w:t>
-      </w:r>
-    </w:p>
-    <w:p>
-      <w:pPr>
-        <w:pStyle w:val="ListParagraph"/>
-        <w:numPr>
-          <w:ilvl w:val="0"/>
-          <w:numId w:val="15"/>
-        </w:numPr>
-        <w:spacing w:after="100" w:line="300"/>
-        <w:jc w:val="both"/>
-      </w:pPr>
-      <w:r>
-        <w:rPr>
-          <w:rFonts w:ascii="Times New Roman" w:cs="Times New Roman" w:eastAsia="Times New Roman" w:hAnsi="Times New Roman"/>
-          <w:sz w:val="26"/>
-          <w:szCs w:val="26"/>
-        </w:rPr>
-        <w:t xml:space="preserve">Kết thúc: </w:t>
-      </w:r>
-      <w:r>
-        <w:rPr>
-          <w:rFonts w:ascii="Times New Roman" w:cs="Times New Roman" w:eastAsia="Times New Roman" w:hAnsi="Times New Roman"/>
-          <w:b/>
-          <w:bCs/>
-          <w:sz w:val="26"/>
-          <w:szCs w:val="26"/>
-        </w:rPr>
-        <w:t xml:space="preserve">Xóa dự án tập huấn</w:t>
-      </w:r>
-      <w:r>
-        <w:rPr>
-          <w:rFonts w:ascii="Times New Roman" w:cs="Times New Roman" w:eastAsia="Times New Roman" w:hAnsi="Times New Roman"/>
-          <w:sz w:val="26"/>
-          <w:szCs w:val="26"/>
-        </w:rPr>
-        <w:t xml:space="preserve"> — xóa sạch ngay (cả hộ, bản đồ, tệp), không qua thùng rác.</w:t>
+        <w:t xml:space="preserve">Hình 25. Cài đặt chung — lịch ngày nghỉ</w:t>
       </w:r>
     </w:p>
     <w:p>
@@ -4906,118 +4837,7 @@
           <w:sz w:val="24"/>
           <w:szCs w:val="24"/>
         </w:rPr>
-        <w:t xml:space="preserve">Hình 26. Dự án tập huấn</w:t>
-      </w:r>
-    </w:p>
-    <w:p>
-      <w:pPr>
-        <w:pStyle w:val="Heading1"/>
-        <w:pageBreakBefore/>
-        <w:spacing w:after="200"/>
-      </w:pPr>
-      <w:r>
-        <w:rPr>
-          <w:rFonts w:ascii="Times New Roman" w:cs="Times New Roman" w:eastAsia="Times New Roman" w:hAnsi="Times New Roman"/>
-          <w:b/>
-          <w:bCs/>
-          <w:sz w:val="28"/>
-          <w:szCs w:val="28"/>
-        </w:rPr>
-        <w:t xml:space="preserve">15. PHÍM TẮT, THAO TÁC NHANH</w:t>
-      </w:r>
-    </w:p>
-    <w:p>
-      <w:pPr>
-        <w:pStyle w:val="ListParagraph"/>
-        <w:numPr>
-          <w:ilvl w:val="0"/>
-          <w:numId w:val="16"/>
-        </w:numPr>
-        <w:spacing w:after="100" w:line="300"/>
-        <w:jc w:val="both"/>
-      </w:pPr>
-      <w:r>
-        <w:rPr>
-          <w:rFonts w:ascii="Times New Roman" w:cs="Times New Roman" w:eastAsia="Times New Roman" w:hAnsi="Times New Roman"/>
-          <w:sz w:val="26"/>
-          <w:szCs w:val="26"/>
-        </w:rPr>
-        <w:t xml:space="preserve">Ctrl + K: tìm dự án, hộ, tờ/thửa (không cần dấu). F1: bảng phím tắt. Alt + 1…6: chuyển màn. Alt + ←: quay lại.</w:t>
-      </w:r>
-    </w:p>
-    <w:p>
-      <w:pPr>
-        <w:pStyle w:val="ListParagraph"/>
-        <w:numPr>
-          <w:ilvl w:val="0"/>
-          <w:numId w:val="16"/>
-        </w:numPr>
-        <w:spacing w:after="100" w:line="300"/>
-        <w:jc w:val="both"/>
-      </w:pPr>
-      <w:r>
-        <w:rPr>
-          <w:rFonts w:ascii="Times New Roman" w:cs="Times New Roman" w:eastAsia="Times New Roman" w:hAnsi="Times New Roman"/>
-          <w:sz w:val="26"/>
-          <w:szCs w:val="26"/>
-        </w:rPr>
-        <w:t xml:space="preserve">Ctrl + S: lưu; Ctrl + Enter: lưu và sang thẻ tiếp theo; Esc: đóng hộp thoại; F5: nạp lại dữ liệu (không mất dữ liệu đang nhập).</w:t>
-      </w:r>
-    </w:p>
-    <w:p>
-      <w:pPr>
-        <w:pStyle w:val="ListParagraph"/>
-        <w:numPr>
-          <w:ilvl w:val="0"/>
-          <w:numId w:val="16"/>
-        </w:numPr>
-        <w:spacing w:after="100" w:line="300"/>
-        <w:jc w:val="both"/>
-      </w:pPr>
-      <w:r>
-        <w:rPr>
-          <w:rFonts w:ascii="Times New Roman" w:cs="Times New Roman" w:eastAsia="Times New Roman" w:hAnsi="Times New Roman"/>
-          <w:sz w:val="26"/>
-          <w:szCs w:val="26"/>
-        </w:rPr>
-        <w:t xml:space="preserve">Chuột phải: menu theo ngữ cảnh (sao chép bảng sang Excel, mở hồ sơ ở thẻ cần làm, lịch sử thay đổi của một ô…).</w:t>
-      </w:r>
-    </w:p>
-    <w:p>
-      <w:pPr>
-        <w:pStyle w:val="ListParagraph"/>
-        <w:numPr>
-          <w:ilvl w:val="0"/>
-          <w:numId w:val="16"/>
-        </w:numPr>
-        <w:spacing w:after="100" w:line="300"/>
-        <w:jc w:val="both"/>
-      </w:pPr>
-      <w:r>
-        <w:rPr>
-          <w:rFonts w:ascii="Times New Roman" w:cs="Times New Roman" w:eastAsia="Times New Roman" w:hAnsi="Times New Roman"/>
-          <w:sz w:val="26"/>
-          <w:szCs w:val="26"/>
-        </w:rPr>
-        <w:t xml:space="preserve">Thanh bên → </w:t>
-      </w:r>
-      <w:r>
-        <w:rPr>
-          <w:rFonts w:ascii="Times New Roman" w:cs="Times New Roman" w:eastAsia="Times New Roman" w:hAnsi="Times New Roman"/>
-          <w:b/>
-          <w:bCs/>
-          <w:sz w:val="26"/>
-          <w:szCs w:val="26"/>
-        </w:rPr>
-        <w:t xml:space="preserve">Hướng dẫn sử dụng</w:t>
-      </w:r>
-      <w:r>
-        <w:rPr>
-          <w:rFonts w:ascii="Times New Roman" w:cs="Times New Roman" w:eastAsia="Times New Roman" w:hAnsi="Times New Roman"/>
-          <w:sz w:val="26"/>
-          <w:szCs w:val="26"/>
-        </w:rPr>
-        <w:t xml:space="preserve">: hướng dẫn tóm tắt trong phần mềm, tìm kiếm, nút mở đúng màn hình.</w:t>
+        <w:t xml:space="preserve">Hình 26. Cài đặt chung — Thẩm quyền phân cấp (QĐ 27/2026)</w:t>
       </w:r>
     </w:p>
     <w:p>
@@ -5080,7 +4900,387 @@
           <w:sz w:val="24"/>
           <w:szCs w:val="24"/>
         </w:rPr>
-        <w:t xml:space="preserve">Hình 27. Hướng dẫn sử dụng trong phần mềm</w:t>
+        <w:t xml:space="preserve">Hình 27. Giới thiệu, bản quyền — cập nhật, nhật ký sự cố</w:t>
+      </w:r>
+    </w:p>
+    <w:p>
+      <w:pPr>
+        <w:pStyle w:val="Heading1"/>
+        <w:pageBreakBefore/>
+        <w:spacing w:after="200"/>
+      </w:pPr>
+      <w:r>
+        <w:rPr>
+          <w:rFonts w:ascii="Times New Roman" w:cs="Times New Roman" w:eastAsia="Times New Roman" w:hAnsi="Times New Roman"/>
+          <w:b/>
+          <w:bCs/>
+          <w:sz w:val="28"/>
+          <w:szCs w:val="28"/>
+        </w:rPr>
+        <w:t xml:space="preserve">14. DỰ ÁN TẬP HUẤN</w:t>
+      </w:r>
+    </w:p>
+    <w:p>
+      <w:pPr>
+        <w:spacing w:after="120" w:line="300"/>
+        <w:ind w:firstLine="567"/>
+        <w:jc w:val="both"/>
+      </w:pPr>
+      <w:r>
+        <w:rPr>
+          <w:rFonts w:ascii="Times New Roman" w:cs="Times New Roman" w:eastAsia="Times New Roman" w:hAnsi="Times New Roman"/>
+          <w:sz w:val="26"/>
+          <w:szCs w:val="26"/>
+        </w:rPr>
+        <w:t xml:space="preserve">Dùng để tập huấn cán bộ: 6 hộ ở các giai đoạn khác nhau, bản đồ DXF giả lập 18 thửa có ranh GPMB, một đơn khiếu nại mẫu, một hộ có vướng mắc. Không có thông tin cá nhân thật.</w:t>
+      </w:r>
+    </w:p>
+    <w:p>
+      <w:pPr>
+        <w:pStyle w:val="ListParagraph"/>
+        <w:numPr>
+          <w:ilvl w:val="0"/>
+          <w:numId w:val="15"/>
+        </w:numPr>
+        <w:spacing w:after="100" w:line="300"/>
+        <w:jc w:val="both"/>
+      </w:pPr>
+      <w:r>
+        <w:rPr>
+          <w:rFonts w:ascii="Times New Roman" w:cs="Times New Roman" w:eastAsia="Times New Roman" w:hAnsi="Times New Roman"/>
+          <w:sz w:val="26"/>
+          <w:szCs w:val="26"/>
+        </w:rPr>
+        <w:t xml:space="preserve">Thanh bên → </w:t>
+      </w:r>
+      <w:r>
+        <w:rPr>
+          <w:rFonts w:ascii="Times New Roman" w:cs="Times New Roman" w:eastAsia="Times New Roman" w:hAnsi="Times New Roman"/>
+          <w:b/>
+          <w:bCs/>
+          <w:sz w:val="26"/>
+          <w:szCs w:val="26"/>
+        </w:rPr>
+        <w:t xml:space="preserve">Dự án</w:t>
+      </w:r>
+      <w:r>
+        <w:rPr>
+          <w:rFonts w:ascii="Times New Roman" w:cs="Times New Roman" w:eastAsia="Times New Roman" w:hAnsi="Times New Roman"/>
+          <w:sz w:val="26"/>
+          <w:szCs w:val="26"/>
+        </w:rPr>
+        <w:t xml:space="preserve"> → </w:t>
+      </w:r>
+      <w:r>
+        <w:rPr>
+          <w:rFonts w:ascii="Times New Roman" w:cs="Times New Roman" w:eastAsia="Times New Roman" w:hAnsi="Times New Roman"/>
+          <w:b/>
+          <w:bCs/>
+          <w:sz w:val="26"/>
+          <w:szCs w:val="26"/>
+        </w:rPr>
+        <w:t xml:space="preserve">Tạo dự án tập huấn</w:t>
+      </w:r>
+      <w:r>
+        <w:rPr>
+          <w:rFonts w:ascii="Times New Roman" w:cs="Times New Roman" w:eastAsia="Times New Roman" w:hAnsi="Times New Roman"/>
+          <w:sz w:val="26"/>
+          <w:szCs w:val="26"/>
+        </w:rPr>
+        <w:t xml:space="preserve">.</w:t>
+      </w:r>
+    </w:p>
+    <w:p>
+      <w:pPr>
+        <w:pStyle w:val="ListParagraph"/>
+        <w:numPr>
+          <w:ilvl w:val="0"/>
+          <w:numId w:val="15"/>
+        </w:numPr>
+        <w:spacing w:after="100" w:line="300"/>
+        <w:jc w:val="both"/>
+      </w:pPr>
+      <w:r>
+        <w:rPr>
+          <w:rFonts w:ascii="Times New Roman" w:cs="Times New Roman" w:eastAsia="Times New Roman" w:hAnsi="Times New Roman"/>
+          <w:sz w:val="26"/>
+          <w:szCs w:val="26"/>
+        </w:rPr>
+        <w:t xml:space="preserve">Bài tập gợi ý: (1) Bản đồ → chọn vùng ranh GPMB → xem diện tích thu hồi từng thửa; (2) hộ H03 → Thửa đất → chọn giá đất cho thửa HNK; (3) Soát, chốt, phê duyệt phương án; (4) soạn thông báo, quyết định; (5) ghi chi trả, bàn giao; (6) ghi khiếu nại, cưỡng chế; (7) xuất báo cáo.</w:t>
+      </w:r>
+    </w:p>
+    <w:p>
+      <w:pPr>
+        <w:pStyle w:val="ListParagraph"/>
+        <w:numPr>
+          <w:ilvl w:val="0"/>
+          <w:numId w:val="15"/>
+        </w:numPr>
+        <w:spacing w:after="100" w:line="300"/>
+        <w:jc w:val="both"/>
+      </w:pPr>
+      <w:r>
+        <w:rPr>
+          <w:rFonts w:ascii="Times New Roman" w:cs="Times New Roman" w:eastAsia="Times New Roman" w:hAnsi="Times New Roman"/>
+          <w:sz w:val="26"/>
+          <w:szCs w:val="26"/>
+        </w:rPr>
+        <w:t xml:space="preserve">Kết thúc: </w:t>
+      </w:r>
+      <w:r>
+        <w:rPr>
+          <w:rFonts w:ascii="Times New Roman" w:cs="Times New Roman" w:eastAsia="Times New Roman" w:hAnsi="Times New Roman"/>
+          <w:b/>
+          <w:bCs/>
+          <w:sz w:val="26"/>
+          <w:szCs w:val="26"/>
+        </w:rPr>
+        <w:t xml:space="preserve">Xóa dự án tập huấn</w:t>
+      </w:r>
+      <w:r>
+        <w:rPr>
+          <w:rFonts w:ascii="Times New Roman" w:cs="Times New Roman" w:eastAsia="Times New Roman" w:hAnsi="Times New Roman"/>
+          <w:sz w:val="26"/>
+          <w:szCs w:val="26"/>
+        </w:rPr>
+        <w:t xml:space="preserve"> — xóa sạch ngay (cả hộ, bản đồ, tệp), không qua thùng rác.</w:t>
+      </w:r>
+    </w:p>
+    <w:p>
+      <w:pPr>
+        <w:keepNext/>
+        <w:spacing w:before="160"/>
+        <w:jc w:val="center"/>
+      </w:pPr>
+      <w:r>
+        <w:drawing>
+          <wp:inline distT="0" distB="0" distL="0" distR="0">
+            <wp:extent cx="5715000" cy="3209925"/>
+            <wp:effectExtent t="0" r="0" b="0" l="0"/>
+            <wp:docPr id="1" name="" descr="" title=""/>
+            <wp:cNvGraphicFramePr>
+              <a:graphicFrameLocks xmlns:a="http://schemas.openxmlformats.org/drawingml/2006/main" noChangeAspect="1"/>
+            </wp:cNvGraphicFramePr>
+            <a:graphic xmlns:a="http://schemas.openxmlformats.org/drawingml/2006/main">
+              <a:graphicData uri="http://schemas.openxmlformats.org/drawingml/2006/picture">
+                <pic:pic xmlns:pic="http://schemas.openxmlformats.org/drawingml/2006/picture">
+                  <pic:nvPicPr>
+                    <pic:cNvPr id="0" name="" descr=""/>
+                    <pic:cNvPicPr>
+                      <a:picLocks noChangeAspect="1" noChangeArrowheads="1"/>
+                    </pic:cNvPicPr>
+                  </pic:nvPicPr>
+                  <pic:blipFill>
+                    <a:blip r:embed="rId36" cstate="none"/>
+                    <a:srcRect/>
+                    <a:stretch>
+                      <a:fillRect/>
+                    </a:stretch>
+                  </pic:blipFill>
+                  <pic:spPr bwMode="auto">
+                    <a:xfrm>
+                      <a:off x="0" y="0"/>
+                      <a:ext cx="5715000" cy="3209925"/>
+                    </a:xfrm>
+                    <a:prstGeom prst="rect">
+                      <a:avLst/>
+                    </a:prstGeom>
+                  </pic:spPr>
+                </pic:pic>
+              </a:graphicData>
+            </a:graphic>
+          </wp:inline>
+        </w:drawing>
+      </w:r>
+    </w:p>
+    <w:p>
+      <w:pPr>
+        <w:spacing w:after="200"/>
+        <w:jc w:val="center"/>
+      </w:pPr>
+      <w:r>
+        <w:rPr>
+          <w:rFonts w:ascii="Times New Roman" w:cs="Times New Roman" w:eastAsia="Times New Roman" w:hAnsi="Times New Roman"/>
+          <w:i/>
+          <w:iCs/>
+          <w:sz w:val="24"/>
+          <w:szCs w:val="24"/>
+        </w:rPr>
+        <w:t xml:space="preserve">Hình 28. Dự án tập huấn</w:t>
+      </w:r>
+    </w:p>
+    <w:p>
+      <w:pPr>
+        <w:pStyle w:val="Heading1"/>
+        <w:pageBreakBefore/>
+        <w:spacing w:after="200"/>
+      </w:pPr>
+      <w:r>
+        <w:rPr>
+          <w:rFonts w:ascii="Times New Roman" w:cs="Times New Roman" w:eastAsia="Times New Roman" w:hAnsi="Times New Roman"/>
+          <w:b/>
+          <w:bCs/>
+          <w:sz w:val="28"/>
+          <w:szCs w:val="28"/>
+        </w:rPr>
+        <w:t xml:space="preserve">15. PHÍM TẮT, THAO TÁC NHANH</w:t>
+      </w:r>
+    </w:p>
+    <w:p>
+      <w:pPr>
+        <w:pStyle w:val="ListParagraph"/>
+        <w:numPr>
+          <w:ilvl w:val="0"/>
+          <w:numId w:val="16"/>
+        </w:numPr>
+        <w:spacing w:after="100" w:line="300"/>
+        <w:jc w:val="both"/>
+      </w:pPr>
+      <w:r>
+        <w:rPr>
+          <w:rFonts w:ascii="Times New Roman" w:cs="Times New Roman" w:eastAsia="Times New Roman" w:hAnsi="Times New Roman"/>
+          <w:sz w:val="26"/>
+          <w:szCs w:val="26"/>
+        </w:rPr>
+        <w:t xml:space="preserve">Ctrl + K: tìm dự án, hộ, tờ/thửa (không cần dấu). F1: bảng phím tắt. Alt + 1…6: chuyển màn. Alt + ←: quay lại.</w:t>
+      </w:r>
+    </w:p>
+    <w:p>
+      <w:pPr>
+        <w:pStyle w:val="ListParagraph"/>
+        <w:numPr>
+          <w:ilvl w:val="0"/>
+          <w:numId w:val="16"/>
+        </w:numPr>
+        <w:spacing w:after="100" w:line="300"/>
+        <w:jc w:val="both"/>
+      </w:pPr>
+      <w:r>
+        <w:rPr>
+          <w:rFonts w:ascii="Times New Roman" w:cs="Times New Roman" w:eastAsia="Times New Roman" w:hAnsi="Times New Roman"/>
+          <w:sz w:val="26"/>
+          <w:szCs w:val="26"/>
+        </w:rPr>
+        <w:t xml:space="preserve">Ctrl + S: lưu; Ctrl + Enter: lưu và sang thẻ tiếp theo; Esc: đóng hộp thoại; F5: nạp lại dữ liệu (không mất dữ liệu đang nhập).</w:t>
+      </w:r>
+    </w:p>
+    <w:p>
+      <w:pPr>
+        <w:pStyle w:val="ListParagraph"/>
+        <w:numPr>
+          <w:ilvl w:val="0"/>
+          <w:numId w:val="16"/>
+        </w:numPr>
+        <w:spacing w:after="100" w:line="300"/>
+        <w:jc w:val="both"/>
+      </w:pPr>
+      <w:r>
+        <w:rPr>
+          <w:rFonts w:ascii="Times New Roman" w:cs="Times New Roman" w:eastAsia="Times New Roman" w:hAnsi="Times New Roman"/>
+          <w:sz w:val="26"/>
+          <w:szCs w:val="26"/>
+        </w:rPr>
+        <w:t xml:space="preserve">Chuột phải: menu theo ngữ cảnh (sao chép bảng sang Excel, mở hồ sơ ở thẻ cần làm, lịch sử thay đổi của một ô…).</w:t>
+      </w:r>
+    </w:p>
+    <w:p>
+      <w:pPr>
+        <w:pStyle w:val="ListParagraph"/>
+        <w:numPr>
+          <w:ilvl w:val="0"/>
+          <w:numId w:val="16"/>
+        </w:numPr>
+        <w:spacing w:after="100" w:line="300"/>
+        <w:jc w:val="both"/>
+      </w:pPr>
+      <w:r>
+        <w:rPr>
+          <w:rFonts w:ascii="Times New Roman" w:cs="Times New Roman" w:eastAsia="Times New Roman" w:hAnsi="Times New Roman"/>
+          <w:sz w:val="26"/>
+          <w:szCs w:val="26"/>
+        </w:rPr>
+        <w:t xml:space="preserve">Thanh bên → </w:t>
+      </w:r>
+      <w:r>
+        <w:rPr>
+          <w:rFonts w:ascii="Times New Roman" w:cs="Times New Roman" w:eastAsia="Times New Roman" w:hAnsi="Times New Roman"/>
+          <w:b/>
+          <w:bCs/>
+          <w:sz w:val="26"/>
+          <w:szCs w:val="26"/>
+        </w:rPr>
+        <w:t xml:space="preserve">Hướng dẫn sử dụng</w:t>
+      </w:r>
+      <w:r>
+        <w:rPr>
+          <w:rFonts w:ascii="Times New Roman" w:cs="Times New Roman" w:eastAsia="Times New Roman" w:hAnsi="Times New Roman"/>
+          <w:sz w:val="26"/>
+          <w:szCs w:val="26"/>
+        </w:rPr>
+        <w:t xml:space="preserve">: hướng dẫn tóm tắt trong phần mềm, tìm kiếm, nút mở đúng màn hình.</w:t>
+      </w:r>
+    </w:p>
+    <w:p>
+      <w:pPr>
+        <w:keepNext/>
+        <w:spacing w:before="160"/>
+        <w:jc w:val="center"/>
+      </w:pPr>
+      <w:r>
+        <w:drawing>
+          <wp:inline distT="0" distB="0" distL="0" distR="0">
+            <wp:extent cx="5715000" cy="3209925"/>
+            <wp:effectExtent t="0" r="0" b="0" l="0"/>
+            <wp:docPr id="1" name="" descr="" title=""/>
+            <wp:cNvGraphicFramePr>
+              <a:graphicFrameLocks xmlns:a="http://schemas.openxmlformats.org/drawingml/2006/main" noChangeAspect="1"/>
+            </wp:cNvGraphicFramePr>
+            <a:graphic xmlns:a="http://schemas.openxmlformats.org/drawingml/2006/main">
+              <a:graphicData uri="http://schemas.openxmlformats.org/drawingml/2006/picture">
+                <pic:pic xmlns:pic="http://schemas.openxmlformats.org/drawingml/2006/picture">
+                  <pic:nvPicPr>
+                    <pic:cNvPr id="0" name="" descr=""/>
+                    <pic:cNvPicPr>
+                      <a:picLocks noChangeAspect="1" noChangeArrowheads="1"/>
+                    </pic:cNvPicPr>
+                  </pic:nvPicPr>
+                  <pic:blipFill>
+                    <a:blip r:embed="rId37" cstate="none"/>
+                    <a:srcRect/>
+                    <a:stretch>
+                      <a:fillRect/>
+                    </a:stretch>
+                  </pic:blipFill>
+                  <pic:spPr bwMode="auto">
+                    <a:xfrm>
+                      <a:off x="0" y="0"/>
+                      <a:ext cx="5715000" cy="3209925"/>
+                    </a:xfrm>
+                    <a:prstGeom prst="rect">
+                      <a:avLst/>
+                    </a:prstGeom>
+                  </pic:spPr>
+                </pic:pic>
+              </a:graphicData>
+            </a:graphic>
+          </wp:inline>
+        </w:drawing>
+      </w:r>
+    </w:p>
+    <w:p>
+      <w:pPr>
+        <w:spacing w:after="200"/>
+        <w:jc w:val="center"/>
+      </w:pPr>
+      <w:r>
+        <w:rPr>
+          <w:rFonts w:ascii="Times New Roman" w:cs="Times New Roman" w:eastAsia="Times New Roman" w:hAnsi="Times New Roman"/>
+          <w:i/>
+          <w:iCs/>
+          <w:sz w:val="24"/>
+          <w:szCs w:val="24"/>
+        </w:rPr>
+        <w:t xml:space="preserve">Hình 29. Hướng dẫn sử dụng trong phần mềm</w:t>
       </w:r>
     </w:p>
     <w:sectPr>
@@ -5208,7 +5408,7 @@
         <w:sz w:val="20"/>
         <w:szCs w:val="20"/>
       </w:rPr>
-      <w:t xml:space="preserve">Hướng dẫn sử dụng Phần mềm GPMB Sơn La – phiên bản 1.2.0</w:t>
+      <w:t xml:space="preserve">Hướng dẫn sử dụng Phần mềm GPMB Sơn La – phiên bản 1.3.0</w:t>
     </w:r>
   </w:p>
 </w:hdr>

</xml_diff>